<commit_message>
docs: expand v50 technical report materials
</commit_message>
<xml_diff>
--- a/reports/v50_leadership_report/无线算法大赛_Round1_v50汇报讲稿.docx
+++ b/reports/v50_leadership_report/无线算法大赛_Round1_v50汇报讲稿.docx
@@ -73,7 +73,7 @@
           <w:color w:val="101820"/>
           <w:sz w:val="21"/>
         </w:rPr>
-        <w:t>说明 v50 如何从赛题指标和数据结构出发，构建可解释、可复现的端到端信道生成方案。</w:t>
+        <w:t>说明 v50 如何从赛题指标和数据结构出发，完成点云空间处理、普通克里金、多专家分组融合与完整复信道重建。</w:t>
       </w:r>
     </w:p>
     <w:p>
@@ -88,7 +88,7 @@
           <w:color w:val="5B6673"/>
           <w:sz w:val="22"/>
         </w:rPr>
-        <w:t>建议时长：约 21 分钟  |  17 页</w:t>
+        <w:t>建议时长：约 28 分钟  |  20 页</w:t>
       </w:r>
     </w:p>
     <w:p>
@@ -1477,7 +1477,7 @@
           <w:color w:val="101820"/>
           <w:sz w:val="21"/>
         </w:rPr>
-        <w:t>下一步我们看“点云物理特征”。</w:t>
+        <w:t>下一步我们看“点云栅格化与查询”。</w:t>
       </w:r>
     </w:p>
     <w:p>
@@ -1538,7 +1538,7 @@
           <w:color w:val="1473E6"/>
           <w:sz w:val="20"/>
         </w:rPr>
-        <w:t>第 10 页  |  1:25</w:t>
+        <w:t>第 10 页  |  1:45</w:t>
       </w:r>
     </w:p>
     <w:p>
@@ -1553,7 +1553,7 @@
           <w:color w:val="101820"/>
           <w:sz w:val="32"/>
         </w:rPr>
-        <w:t>点云物理特征</w:t>
+        <w:t>点云栅格化与查询</w:t>
       </w:r>
     </w:p>
     <w:p>
@@ -1581,7 +1581,7 @@
           <w:color w:val="101820"/>
           <w:sz w:val="21"/>
         </w:rPr>
-        <w:t>说明点云如何被转化为可用的传播条件。</w:t>
+        <w:t>逐步说明 PLY 点云如何栅格化并连续查询。</w:t>
       </w:r>
     </w:p>
     <w:p>
@@ -1608,7 +1608,7 @@
           <w:color w:val="101820"/>
           <w:sz w:val="22"/>
         </w:rPr>
-        <w:t>第一项关键设计是把点云变成传播条件。我们没有直接把二百多万个点输入一个大网络，而是围绕终端位置和基站到终端的连线提取三类紧凑特征：局部障碍密度和高度、传播走廊的遮挡程度，以及方位角和径向位置等方向上下文。这些特征不是在模型入口使用一次就结束，而是同时参与邻域距离修正、专家权重选择和最终残差校准。它解决的核心问题是：两个点虽然欧氏距离相同，但如果一个隔着建筑、另一个位于开阔走廊，它们对目标位置的参考价值完全不同。</w:t>
+        <w:t>点云处理分四步。第一步解析 PLY 头并用内存映射读取约 238 万个包含坐标和法向的顶点，避免一次性复制全部数据。第二步把 XY 平面按 2 米分辨率离散，每 25 万点一块累积。第三步在每个格子中保存最高和平均高度、高度标准差、总点密度、竖直墙面密度、水平面密度以及墙法向的二阶矩。第四步查询测试坐标时，把坐标转换成栅格位置，用双线性插值获得连续特征。这样做不是简单降采样，而是把点云转换成一个可重复查询的传播环境场。</w:t>
       </w:r>
     </w:p>
     <w:p>
@@ -1636,7 +1636,7 @@
           <w:color w:val="101820"/>
           <w:sz w:val="21"/>
         </w:rPr>
-        <w:t>下一步我们看“局部多专家空间预测”。</w:t>
+        <w:t>下一步我们看“209 维点云物理特征”。</w:t>
       </w:r>
     </w:p>
     <w:p>
@@ -1664,7 +1664,7 @@
           <w:color w:val="5B6673"/>
           <w:sz w:val="17"/>
         </w:rPr>
-        <w:t>https://github.com/1667482432-max/v39/blob/main/CODE_EXPLANATION.md</w:t>
+        <w:t>https://github.com/1667482432-max/v39/blob/main/physical_ai/map_encoder.py</w:t>
       </w:r>
     </w:p>
     <w:p>
@@ -1678,7 +1678,7 @@
           <w:color w:val="5B6673"/>
           <w:sz w:val="17"/>
         </w:rPr>
-        <w:t>https://github.com/1667482432-max/v39/tree/main/physical_ai</w:t>
+        <w:t>https://github.com/1667482432-max/v39/blob/main/physical_ai/advanced_map.py</w:t>
       </w:r>
     </w:p>
     <w:p>
@@ -1697,7 +1697,7 @@
           <w:color w:val="1473E6"/>
           <w:sz w:val="20"/>
         </w:rPr>
-        <w:t>第 11 页  |  1:35</w:t>
+        <w:t>第 11 页  |  1:55</w:t>
       </w:r>
     </w:p>
     <w:p>
@@ -1712,7 +1712,7 @@
           <w:color w:val="101820"/>
           <w:sz w:val="32"/>
         </w:rPr>
-        <w:t>局部多专家空间预测</w:t>
+        <w:t>209 维点云物理特征</w:t>
       </w:r>
     </w:p>
     <w:p>
@@ -1740,7 +1740,7 @@
           <w:color w:val="101820"/>
           <w:sz w:val="21"/>
         </w:rPr>
-        <w:t>拆解局部多专家空间预测的工作机制。</w:t>
+        <w:t>拆解 209 维高级地图特征的物理含义。</w:t>
       </w:r>
     </w:p>
     <w:p>
@@ -1767,7 +1767,456 @@
           <w:color w:val="101820"/>
           <w:sz w:val="22"/>
         </w:rPr>
-        <w:t>第二项设计是局部多专家空间预测。首先在训练集中为目标点寻找候选邻域，然后从普通欧氏坐标、径向和方位坐标以及地图条件距离等多个几何视角构造邻居。基础专家包括局部克里金、距离核回归和面向不同谱分组的专家，之后再通过图传播修正邻域一致性和边界残差。最后不是固定平均，而是根据目标样本的局部密度、距离结构和地图上下文自适应分配专家权重。这样既能利用训练测试点距离近的优势，也能避免单一 KNN 在建筑边界附近选错邻居。</w:t>
+        <w:t>高级地图编码共 209 维。首先沿基站到终端直线取 64 个采样点，并沿法向平移成 7 条走廊，每条计算最大超高、平均正超高、阻塞比例、中段加权超高、峰值位置和阻塞状态转移率，共 42 维。然后在相同走廊上加入墙密度、墙法向与传播方向的对齐程度以及高度粗糙度，共 28 维。终端周围在 2 到 32 米五个半径上统计环形环境，共 35 维。天际线在三个半径、16 个方向上采样高度和墙密度，并旋转到第零扇区朝向基站，共 96 维。最后加入四个尺度的高度和墙密度平滑，共 8 维。</w:t>
+      </w:r>
+    </w:p>
+    <w:p>
+      <w:pPr w:contextualSpacing="0">
+        <w:spacing w:before="120" w:after="200" w:line="288" w:lineRule="auto"/>
+        <w:ind w:left="259" w:right="173"/>
+        <w:shd w:fill="EEF5FC"/>
+        <w:pBdr>
+          <w:left w:val="single" w:sz="18" w:space="8" w:color="16835A"/>
+        </w:pBdr>
+      </w:pPr>
+      <w:r>
+        <w:rPr>
+          <w:rFonts w:ascii="Microsoft YaHei" w:hAnsi="Microsoft YaHei" w:eastAsia="Microsoft YaHei"/>
+          <w:b/>
+          <w:color w:val="16835A"/>
+          <w:sz w:val="20"/>
+        </w:rPr>
+        <w:t>过渡句</w:t>
+        <w:br/>
+      </w:r>
+      <w:r>
+        <w:rPr>
+          <w:rFonts w:ascii="Microsoft YaHei" w:hAnsi="Microsoft YaHei" w:eastAsia="Microsoft YaHei"/>
+          <w:color w:val="101820"/>
+          <w:sz w:val="21"/>
+        </w:rPr>
+        <w:t>下一步我们看“普通克里金计算细节”。</w:t>
+      </w:r>
+    </w:p>
+    <w:p>
+      <w:pPr>
+        <w:spacing w:before="0" w:after="80" w:line="240" w:lineRule="auto"/>
+      </w:pPr>
+      <w:r>
+        <w:rPr>
+          <w:rFonts w:ascii="Microsoft YaHei" w:hAnsi="Microsoft YaHei" w:eastAsia="Microsoft YaHei"/>
+          <w:b/>
+          <w:color w:val="5B6673"/>
+          <w:sz w:val="20"/>
+        </w:rPr>
+        <w:t>资料来源</w:t>
+      </w:r>
+    </w:p>
+    <w:p>
+      <w:pPr>
+        <w:spacing w:before="0" w:after="40" w:line="252" w:lineRule="auto"/>
+        <w:ind w:left="259"/>
+      </w:pPr>
+      <w:r>
+        <w:rPr>
+          <w:rFonts w:ascii="Microsoft YaHei" w:hAnsi="Microsoft YaHei" w:eastAsia="Microsoft YaHei"/>
+          <w:color w:val="5B6673"/>
+          <w:sz w:val="17"/>
+        </w:rPr>
+        <w:t>https://github.com/1667482432-max/v39/blob/main/physical_ai/advanced_map.py</w:t>
+      </w:r>
+    </w:p>
+    <w:p>
+      <w:r>
+        <w:br w:type="page"/>
+      </w:r>
+    </w:p>
+    <w:p>
+      <w:pPr>
+        <w:spacing w:before="0" w:after="80" w:line="240" w:lineRule="auto"/>
+      </w:pPr>
+      <w:r>
+        <w:rPr>
+          <w:rFonts w:ascii="Microsoft YaHei" w:hAnsi="Microsoft YaHei" w:eastAsia="Microsoft YaHei"/>
+          <w:b/>
+          <w:color w:val="1473E6"/>
+          <w:sz w:val="20"/>
+        </w:rPr>
+        <w:t>第 12 页  |  2:10</w:t>
+      </w:r>
+    </w:p>
+    <w:p>
+      <w:pPr>
+        <w:pStyle w:val="Heading1"/>
+        <w:spacing w:before="80"/>
+      </w:pPr>
+      <w:r>
+        <w:rPr>
+          <w:rFonts w:ascii="Microsoft YaHei" w:hAnsi="Microsoft YaHei" w:eastAsia="Microsoft YaHei"/>
+          <w:b/>
+          <w:color w:val="101820"/>
+          <w:sz w:val="32"/>
+        </w:rPr>
+        <w:t>普通克里金计算细节</w:t>
+      </w:r>
+    </w:p>
+    <w:p>
+      <w:pPr w:contextualSpacing="0">
+        <w:spacing w:before="120" w:after="200" w:line="288" w:lineRule="auto"/>
+        <w:ind w:left="259" w:right="173"/>
+        <w:shd w:fill="EEF5FC"/>
+        <w:pBdr>
+          <w:left w:val="single" w:sz="18" w:space="8" w:color="1473E6"/>
+        </w:pBdr>
+      </w:pPr>
+      <w:r>
+        <w:rPr>
+          <w:rFonts w:ascii="Microsoft YaHei" w:hAnsi="Microsoft YaHei" w:eastAsia="Microsoft YaHei"/>
+          <w:b/>
+          <w:color w:val="1473E6"/>
+          <w:sz w:val="20"/>
+        </w:rPr>
+        <w:t>本页任务</w:t>
+        <w:br/>
+      </w:r>
+      <w:r>
+        <w:rPr>
+          <w:rFonts w:ascii="Microsoft YaHei" w:hAnsi="Microsoft YaHei" w:eastAsia="Microsoft YaHei"/>
+          <w:color w:val="101820"/>
+          <w:sz w:val="21"/>
+        </w:rPr>
+        <w:t>用五步与增广方程讲清普通克里金如何计算。</w:t>
+      </w:r>
+    </w:p>
+    <w:p>
+      <w:pPr>
+        <w:spacing w:before="0" w:after="80" w:line="240" w:lineRule="auto"/>
+      </w:pPr>
+      <w:r>
+        <w:rPr>
+          <w:rFonts w:ascii="Microsoft YaHei" w:hAnsi="Microsoft YaHei" w:eastAsia="Microsoft YaHei"/>
+          <w:b/>
+          <w:color w:val="101820"/>
+          <w:sz w:val="20"/>
+        </w:rPr>
+        <w:t>讲稿</w:t>
+      </w:r>
+    </w:p>
+    <w:p>
+      <w:pPr>
+        <w:spacing w:before="0" w:after="240" w:line="324" w:lineRule="auto"/>
+      </w:pPr>
+      <w:r>
+        <w:rPr>
+          <w:rFonts w:ascii="Microsoft YaHei" w:hAnsi="Microsoft YaHei" w:eastAsia="Microsoft YaHei"/>
+          <w:color w:val="101820"/>
+          <w:sz w:val="22"/>
+        </w:rPr>
+        <w:t>克里金不是按距离倒数简单加权。对一个测试点，第一步在某个地图条件嵌入中用 cKDTree 找 K 个邻居。第二步把第 K 个邻居的距离乘带宽系数，得到随局部密度变化的带宽。第三步计算邻居两两协方差矩阵和查询点到邻居的协方差向量，核函数可以是指数核或 Matérn 三分之二，并在对角线上加 nugget 保证数值稳定。第四步解增广线性方程，最后一行强制权重和为 1，从而无偏重建常量场。第五步用这些权重对邻居的 2560 维紧凑谱求和。某些专家允许负权重以进行局部趋势外推，另一些专家把负权重裁零后重新归一化。</w:t>
+      </w:r>
+    </w:p>
+    <w:p>
+      <w:pPr w:contextualSpacing="0">
+        <w:spacing w:before="120" w:after="200" w:line="288" w:lineRule="auto"/>
+        <w:ind w:left="259" w:right="173"/>
+        <w:shd w:fill="EEF5FC"/>
+        <w:pBdr>
+          <w:left w:val="single" w:sz="18" w:space="8" w:color="16835A"/>
+        </w:pBdr>
+      </w:pPr>
+      <w:r>
+        <w:rPr>
+          <w:rFonts w:ascii="Microsoft YaHei" w:hAnsi="Microsoft YaHei" w:eastAsia="Microsoft YaHei"/>
+          <w:b/>
+          <w:color w:val="16835A"/>
+          <w:sz w:val="20"/>
+        </w:rPr>
+        <w:t>过渡句</w:t>
+        <w:br/>
+      </w:r>
+      <w:r>
+        <w:rPr>
+          <w:rFonts w:ascii="Microsoft YaHei" w:hAnsi="Microsoft YaHei" w:eastAsia="Microsoft YaHei"/>
+          <w:color w:val="101820"/>
+          <w:sz w:val="21"/>
+        </w:rPr>
+        <w:t>下一步我们看“15 个克里金专家”。</w:t>
+      </w:r>
+    </w:p>
+    <w:p>
+      <w:pPr>
+        <w:spacing w:before="0" w:after="80" w:line="240" w:lineRule="auto"/>
+      </w:pPr>
+      <w:r>
+        <w:rPr>
+          <w:rFonts w:ascii="Microsoft YaHei" w:hAnsi="Microsoft YaHei" w:eastAsia="Microsoft YaHei"/>
+          <w:b/>
+          <w:color w:val="5B6673"/>
+          <w:sz w:val="20"/>
+        </w:rPr>
+        <w:t>资料来源</w:t>
+      </w:r>
+    </w:p>
+    <w:p>
+      <w:pPr>
+        <w:spacing w:before="0" w:after="40" w:line="252" w:lineRule="auto"/>
+        <w:ind w:left="259"/>
+      </w:pPr>
+      <w:r>
+        <w:rPr>
+          <w:rFonts w:ascii="Microsoft YaHei" w:hAnsi="Microsoft YaHei" w:eastAsia="Microsoft YaHei"/>
+          <w:color w:val="5B6673"/>
+          <w:sz w:val="17"/>
+        </w:rPr>
+        <w:t>https://github.com/1667482432-max/v39/blob/main/physical_ai/spatial.py</w:t>
+      </w:r>
+    </w:p>
+    <w:p>
+      <w:r>
+        <w:br w:type="page"/>
+      </w:r>
+    </w:p>
+    <w:p>
+      <w:pPr>
+        <w:spacing w:before="0" w:after="80" w:line="240" w:lineRule="auto"/>
+      </w:pPr>
+      <w:r>
+        <w:rPr>
+          <w:rFonts w:ascii="Microsoft YaHei" w:hAnsi="Microsoft YaHei" w:eastAsia="Microsoft YaHei"/>
+          <w:b/>
+          <w:color w:val="1473E6"/>
+          <w:sz w:val="20"/>
+        </w:rPr>
+        <w:t>第 13 页  |  1:55</w:t>
+      </w:r>
+    </w:p>
+    <w:p>
+      <w:pPr>
+        <w:pStyle w:val="Heading1"/>
+        <w:spacing w:before="80"/>
+      </w:pPr>
+      <w:r>
+        <w:rPr>
+          <w:rFonts w:ascii="Microsoft YaHei" w:hAnsi="Microsoft YaHei" w:eastAsia="Microsoft YaHei"/>
+          <w:b/>
+          <w:color w:val="101820"/>
+          <w:sz w:val="32"/>
+        </w:rPr>
+        <w:t>15 个克里金专家</w:t>
+      </w:r>
+    </w:p>
+    <w:p>
+      <w:pPr w:contextualSpacing="0">
+        <w:spacing w:before="120" w:after="200" w:line="288" w:lineRule="auto"/>
+        <w:ind w:left="259" w:right="173"/>
+        <w:shd w:fill="EEF5FC"/>
+        <w:pBdr>
+          <w:left w:val="single" w:sz="18" w:space="8" w:color="1473E6"/>
+        </w:pBdr>
+      </w:pPr>
+      <w:r>
+        <w:rPr>
+          <w:rFonts w:ascii="Microsoft YaHei" w:hAnsi="Microsoft YaHei" w:eastAsia="Microsoft YaHei"/>
+          <w:b/>
+          <w:color w:val="1473E6"/>
+          <w:sz w:val="20"/>
+        </w:rPr>
+        <w:t>本页任务</w:t>
+        <w:br/>
+      </w:r>
+      <w:r>
+        <w:rPr>
+          <w:rFonts w:ascii="Microsoft YaHei" w:hAnsi="Microsoft YaHei" w:eastAsia="Microsoft YaHei"/>
+          <w:color w:val="101820"/>
+          <w:sz w:val="21"/>
+        </w:rPr>
+        <w:t>说明 15 个专家的参数差异与各自预测对象。</w:t>
+      </w:r>
+    </w:p>
+    <w:p>
+      <w:pPr>
+        <w:spacing w:before="0" w:after="80" w:line="240" w:lineRule="auto"/>
+      </w:pPr>
+      <w:r>
+        <w:rPr>
+          <w:rFonts w:ascii="Microsoft YaHei" w:hAnsi="Microsoft YaHei" w:eastAsia="Microsoft YaHei"/>
+          <w:b/>
+          <w:color w:val="101820"/>
+          <w:sz w:val="20"/>
+        </w:rPr>
+        <w:t>讲稿</w:t>
+      </w:r>
+    </w:p>
+    <w:p>
+      <w:pPr>
+        <w:spacing w:before="0" w:after="240" w:line="324" w:lineRule="auto"/>
+      </w:pPr>
+      <w:r>
+        <w:rPr>
+          <w:rFonts w:ascii="Microsoft YaHei" w:hAnsi="Microsoft YaHei" w:eastAsia="Microsoft YaHei"/>
+          <w:color w:val="101820"/>
+          <w:sz w:val="22"/>
+        </w:rPr>
+        <w:t>这里的 15 个专家并不是 15 个大型神经网络，而是经过五折验证筛选出的 15 套克里金配置。它们在六个维度上形成差异：邻居数是 16、24 或 32；带宽尺度从 0.5 到 1.5；nugget 从 0.001 到 0.1；核函数使用指数核或 Matérn 三分之二；邻域距离分别使用局部 patch、完整上下文或摘要嵌入；权重可以限制为正，也可以允许有符号外推。每个专家都输出同一目标点完整的 2560 维紧凑谱，差别是对空间规律的假设不同，因此能够覆盖密集区、边界区、遮挡区和不同谱组。</w:t>
+      </w:r>
+    </w:p>
+    <w:p>
+      <w:pPr w:contextualSpacing="0">
+        <w:spacing w:before="120" w:after="200" w:line="288" w:lineRule="auto"/>
+        <w:ind w:left="259" w:right="173"/>
+        <w:shd w:fill="EEF5FC"/>
+        <w:pBdr>
+          <w:left w:val="single" w:sz="18" w:space="8" w:color="16835A"/>
+        </w:pBdr>
+      </w:pPr>
+      <w:r>
+        <w:rPr>
+          <w:rFonts w:ascii="Microsoft YaHei" w:hAnsi="Microsoft YaHei" w:eastAsia="Microsoft YaHei"/>
+          <w:b/>
+          <w:color w:val="16835A"/>
+          <w:sz w:val="20"/>
+        </w:rPr>
+        <w:t>过渡句</w:t>
+        <w:br/>
+      </w:r>
+      <w:r>
+        <w:rPr>
+          <w:rFonts w:ascii="Microsoft YaHei" w:hAnsi="Microsoft YaHei" w:eastAsia="Microsoft YaHei"/>
+          <w:color w:val="101820"/>
+          <w:sz w:val="21"/>
+        </w:rPr>
+        <w:t>下一步我们看“分组多专家门控”。</w:t>
+      </w:r>
+    </w:p>
+    <w:p>
+      <w:pPr>
+        <w:spacing w:before="0" w:after="80" w:line="240" w:lineRule="auto"/>
+      </w:pPr>
+      <w:r>
+        <w:rPr>
+          <w:rFonts w:ascii="Microsoft YaHei" w:hAnsi="Microsoft YaHei" w:eastAsia="Microsoft YaHei"/>
+          <w:b/>
+          <w:color w:val="5B6673"/>
+          <w:sz w:val="20"/>
+        </w:rPr>
+        <w:t>资料来源</w:t>
+      </w:r>
+    </w:p>
+    <w:p>
+      <w:pPr>
+        <w:spacing w:before="0" w:after="40" w:line="252" w:lineRule="auto"/>
+        <w:ind w:left="259"/>
+      </w:pPr>
+      <w:r>
+        <w:rPr>
+          <w:rFonts w:ascii="Microsoft YaHei" w:hAnsi="Microsoft YaHei" w:eastAsia="Microsoft YaHei"/>
+          <w:color w:val="5B6673"/>
+          <w:sz w:val="17"/>
+        </w:rPr>
+        <w:t>https://github.com/1667482432-max/v39/blob/main/predict.py</w:t>
+      </w:r>
+    </w:p>
+    <w:p>
+      <w:pPr>
+        <w:spacing w:before="0" w:after="40" w:line="252" w:lineRule="auto"/>
+        <w:ind w:left="259"/>
+      </w:pPr>
+      <w:r>
+        <w:rPr>
+          <w:rFonts w:ascii="Microsoft YaHei" w:hAnsi="Microsoft YaHei" w:eastAsia="Microsoft YaHei"/>
+          <w:color w:val="5B6673"/>
+          <w:sz w:val="17"/>
+        </w:rPr>
+        <w:t>https://github.com/1667482432-max/v39/blob/main/physical_ai/spatial.py</w:t>
+      </w:r>
+    </w:p>
+    <w:p>
+      <w:r>
+        <w:br w:type="page"/>
+      </w:r>
+    </w:p>
+    <w:p>
+      <w:pPr>
+        <w:spacing w:before="0" w:after="80" w:line="240" w:lineRule="auto"/>
+      </w:pPr>
+      <w:r>
+        <w:rPr>
+          <w:rFonts w:ascii="Microsoft YaHei" w:hAnsi="Microsoft YaHei" w:eastAsia="Microsoft YaHei"/>
+          <w:b/>
+          <w:color w:val="1473E6"/>
+          <w:sz w:val="20"/>
+        </w:rPr>
+        <w:t>第 14 页  |  2:15</w:t>
+      </w:r>
+    </w:p>
+    <w:p>
+      <w:pPr>
+        <w:pStyle w:val="Heading1"/>
+        <w:spacing w:before="80"/>
+      </w:pPr>
+      <w:r>
+        <w:rPr>
+          <w:rFonts w:ascii="Microsoft YaHei" w:hAnsi="Microsoft YaHei" w:eastAsia="Microsoft YaHei"/>
+          <w:b/>
+          <w:color w:val="101820"/>
+          <w:sz w:val="32"/>
+        </w:rPr>
+        <w:t>分组多专家门控</w:t>
+      </w:r>
+    </w:p>
+    <w:p>
+      <w:pPr w:contextualSpacing="0">
+        <w:spacing w:before="120" w:after="200" w:line="288" w:lineRule="auto"/>
+        <w:ind w:left="259" w:right="173"/>
+        <w:shd w:fill="EEF5FC"/>
+        <w:pBdr>
+          <w:left w:val="single" w:sz="18" w:space="8" w:color="1473E6"/>
+        </w:pBdr>
+      </w:pPr>
+      <w:r>
+        <w:rPr>
+          <w:rFonts w:ascii="Microsoft YaHei" w:hAnsi="Microsoft YaHei" w:eastAsia="Microsoft YaHei"/>
+          <w:b/>
+          <w:color w:val="1473E6"/>
+          <w:sz w:val="20"/>
+        </w:rPr>
+        <w:t>本页任务</w:t>
+        <w:br/>
+      </w:r>
+      <w:r>
+        <w:rPr>
+          <w:rFonts w:ascii="Microsoft YaHei" w:hAnsi="Microsoft YaHei" w:eastAsia="Microsoft YaHei"/>
+          <w:color w:val="101820"/>
+          <w:sz w:val="21"/>
+        </w:rPr>
+        <w:t>说明专家权重如何按样本、按 PAS/PDP 谱组产生。</w:t>
+      </w:r>
+    </w:p>
+    <w:p>
+      <w:pPr>
+        <w:spacing w:before="0" w:after="80" w:line="240" w:lineRule="auto"/>
+      </w:pPr>
+      <w:r>
+        <w:rPr>
+          <w:rFonts w:ascii="Microsoft YaHei" w:hAnsi="Microsoft YaHei" w:eastAsia="Microsoft YaHei"/>
+          <w:b/>
+          <w:color w:val="101820"/>
+          <w:sz w:val="20"/>
+        </w:rPr>
+        <w:t>讲稿</w:t>
+      </w:r>
+    </w:p>
+    <w:p>
+      <w:pPr>
+        <w:spacing w:before="0" w:after="240" w:line="324" w:lineRule="auto"/>
+      </w:pPr>
+      <w:r>
+        <w:rPr>
+          <w:rFonts w:ascii="Microsoft YaHei" w:hAnsi="Microsoft YaHei" w:eastAsia="Microsoft YaHei"/>
+          <w:color w:val="101820"/>
+          <w:sz w:val="22"/>
+        </w:rPr>
+        <w:t>多专家最后不是平均，而是按样本、按谱组预测权重。第一层来自严格折外统计，给出各专家在每个谱组上的基础权重。第二层使用查询位置和基础地图前七维做小幅条件修正。第三层观察专家本身是否一致：先把 15 个专家的输出单位化，计算 15 乘 15 的 Gram 相似度矩阵，再加入各专家谱范数的相对对数和 12 维谱组嵌入，输入一个 96 到 64 再到 15 的小门控网络。三个修正相加后做 softmax。PAS 按四个 UE 分四组，PDP 按两个极化和四个 UE 分八组，因此某个专家可以擅长 UE0 的角谱，却不必同时支配 UE3 的时延谱。</w:t>
       </w:r>
     </w:p>
     <w:p>
@@ -1823,7 +2272,7 @@
           <w:color w:val="5B6673"/>
           <w:sz w:val="17"/>
         </w:rPr>
-        <w:t>https://github.com/1667482432-max/v39/blob/main/CODE_EXPLANATION.md</w:t>
+        <w:t>https://github.com/1667482432-max/v39/blob/main/physical_ai/expert_gate.py</w:t>
       </w:r>
     </w:p>
     <w:p>
@@ -1837,7 +2286,7 @@
           <w:color w:val="5B6673"/>
           <w:sz w:val="17"/>
         </w:rPr>
-        <w:t>https://github.com/1667482432-max/v39/tree/main/physical_ai</w:t>
+        <w:t>https://github.com/1667482432-max/v39/blob/main/predict.py</w:t>
       </w:r>
     </w:p>
     <w:p>
@@ -1856,7 +2305,7 @@
           <w:color w:val="1473E6"/>
           <w:sz w:val="20"/>
         </w:rPr>
-        <w:t>第 12 页  |  1:35</w:t>
+        <w:t>第 15 页  |  1:35</w:t>
       </w:r>
     </w:p>
     <w:p>
@@ -2015,7 +2464,7 @@
           <w:color w:val="1473E6"/>
           <w:sz w:val="20"/>
         </w:rPr>
-        <w:t>第 13 页  |  1:35</w:t>
+        <w:t>第 16 页  |  1:35</w:t>
       </w:r>
     </w:p>
     <w:p>
@@ -2174,7 +2623,7 @@
           <w:color w:val="1473E6"/>
           <w:sz w:val="20"/>
         </w:rPr>
-        <w:t>第 14 页  |  1:40</w:t>
+        <w:t>第 17 页  |  1:40</w:t>
       </w:r>
     </w:p>
     <w:p>
@@ -2333,7 +2782,7 @@
           <w:color w:val="1473E6"/>
           <w:sz w:val="20"/>
         </w:rPr>
-        <w:t>第 15 页  |  1:05</w:t>
+        <w:t>第 18 页  |  1:05</w:t>
       </w:r>
     </w:p>
     <w:p>
@@ -2478,7 +2927,7 @@
           <w:color w:val="1473E6"/>
           <w:sz w:val="20"/>
         </w:rPr>
-        <w:t>第 16 页  |  1:20</w:t>
+        <w:t>第 19 页  |  1:20</w:t>
       </w:r>
     </w:p>
     <w:p>
@@ -2637,7 +3086,7 @@
           <w:color w:val="1473E6"/>
           <w:sz w:val="20"/>
         </w:rPr>
-        <w:t>第 17 页  |  1:00</w:t>
+        <w:t>第 20 页  |  1:00</w:t>
       </w:r>
     </w:p>
     <w:p>

</xml_diff>